<commit_message>
Deploying to gh-pages from @ Morrison-Lab/psc@7301f1e2a59124121b638cc54ccc89e1067eea6e 🚀
</commit_message>
<xml_diff>
--- a/chapters/continuous-integration.docx
+++ b/chapters/continuous-integration.docx
@@ -15,7 +15,7 @@
         <w:pStyle w:val="Date"/>
       </w:pPr>
       <w:r>
-        <w:t xml:space="preserve">Last modified: 2026-10-11 21:04:29 (PDT)</w:t>
+        <w:t xml:space="preserve">Last modified: 2026-10-12 00:36:52 (PDT)</w:t>
       </w:r>
     </w:p>
     <w:p>
@@ -8570,7 +8570,7 @@
       </w:r>
     </w:p>
     <w:bookmarkEnd w:id="73"/>
-    <w:bookmarkStart w:id="81" w:name="additional-resources"/>
+    <w:bookmarkStart w:id="82" w:name="additional-resources"/>
     <w:p>
       <w:pPr>
         <w:pStyle w:val="Heading2"/>
@@ -8718,6 +8718,35 @@
           <w:rPr>
             <w:rStyle w:val="Hyperlink"/>
           </w:rPr>
+          <w:t xml:space="preserve">r-codeberg</w:t>
+        </w:r>
+      </w:hyperlink>
+      <w:r>
+        <w:t xml:space="preserve"> </w:t>
+      </w:r>
+      <w:r>
+        <w:t xml:space="preserve">-</w:t>
+      </w:r>
+      <w:r>
+        <w:t xml:space="preserve"> </w:t>
+      </w:r>
+      <w:r>
+        <w:t xml:space="preserve">community organization supporting R package development and hosting on Codeberg</w:t>
+      </w:r>
+    </w:p>
+    <w:p>
+      <w:pPr>
+        <w:pStyle w:val="Compact"/>
+        <w:numPr>
+          <w:ilvl w:val="0"/>
+          <w:numId w:val="1027"/>
+        </w:numPr>
+      </w:pPr>
+      <w:hyperlink r:id="rId79">
+        <w:r>
+          <w:rPr>
+            <w:rStyle w:val="Hyperlink"/>
+          </w:rPr>
           <w:t xml:space="preserve">r-codeberg migration guide</w:t>
         </w:r>
       </w:hyperlink>
@@ -8748,7 +8777,7 @@
           <w:numId w:val="1027"/>
         </w:numPr>
       </w:pPr>
-      <w:hyperlink r:id="rId79">
+      <w:hyperlink r:id="rId80">
         <w:r>
           <w:rPr>
             <w:rStyle w:val="Hyperlink"/>
@@ -8783,7 +8812,7 @@
           <w:numId w:val="1027"/>
         </w:numPr>
       </w:pPr>
-      <w:hyperlink r:id="rId80">
+      <w:hyperlink r:id="rId81">
         <w:r>
           <w:rPr>
             <w:rStyle w:val="Hyperlink"/>
@@ -8833,7 +8862,7 @@
         <w:t xml:space="preserve">- real-time status of GitHub services</w:t>
       </w:r>
     </w:p>
-    <w:bookmarkEnd w:id="81"/>
+    <w:bookmarkEnd w:id="82"/>
     <w:sectPr>
       <w:footnotePr>
         <w:numRestart w:val="eachSect"/>

</xml_diff>